<commit_message>
Fill in author information on title page
Co-Authored-By: Claude Sonnet 5.5 <noreply@anthropic.com>
Claude-Session: https://claude.ai/code/session_01SvJ27oz7kYhWEBfZS3x4ro
</commit_message>
<xml_diff>
--- a/isr/title_page.docx
+++ b/isr/title_page.docx
@@ -78,7 +78,7 @@
           <w:b w:val="0"/>
           <w:i w:val="0"/>
         </w:rPr>
-        <w:t>[Author 1 name], [Department], [Institution], [City, Country]</w:t>
+        <w:t>Ook Lee, Department of Information System, Hanyang University, Seoul, Korea</w:t>
       </w:r>
     </w:p>
     <w:p>
@@ -90,7 +90,6 @@
           <w:b w:val="0"/>
           <w:i w:val="0"/>
         </w:rPr>
-        <w:t>[Author 2 name], [Department], [Institution], [City, Country]</w:t>
       </w:r>
     </w:p>
     <w:p>
@@ -114,11 +113,11 @@
           <w:b w:val="0"/>
           <w:i w:val="0"/>
         </w:rPr>
-        <w:t>[Name]</w:t>
+        <w:t>Ook Lee</w:t>
         <w:br/>
-        <w:t>[Postal address]</w:t>
+        <w:t>Department of Information System, Hanyang University, Seoul, Korea</w:t>
         <w:br/>
-        <w:t>[Email]</w:t>
+        <w:t>ooklee@hanyang.ac.kr</w:t>
         <w:br/>
         <w:t>[ORCID iD of the submitting author (required by ScholarOne)]</w:t>
       </w:r>

</xml_diff>